<commit_message>
spec: 2026-06-04 consolidation — land all open multi-session edits before the taxonomy/schedule focus moves to a new session
Bundles the day's pending work across the parallel Cowork sessions so the corpus is clean + pushed: fairs/boost contract (+ .docx) + §D owner-validation rows, SEO playbook, Vendor_Match, Onboarding_Blueprint, onboarding city hero assets (assets/cities/*.webp), monogram SVGs. Includes the prior unpushed event-picker commit (70f26bf). Consolidation/catch-up commit — content authored across multiple sessions.

Co-Authored-By: Claude Opus 4.8 <noreply@anthropic.com>
</commit_message>
<xml_diff>
--- a/Onboarding_Blueprint_2026-05-30.docx
+++ b/Onboarding_Blueprint_2026-05-30.docx
@@ -1748,25 +1748,25 @@
                 <w:b/>
                 <w:bCs/>
               </w:rPr>
-              <w:t xml:space="preserve">monogram generates once all four are in</w:t>
-            </w:r>
-            <w:r>
-              <w:t xml:space="preserve"> </w:t>
-            </w:r>
-            <w:r>
-              <w:t xml:space="preserve">(light</w:t>
-            </w:r>
-            <w:r>
-              <w:t xml:space="preserve"> </w:t>
-            </w:r>
-            <w:r>
-              <w:t xml:space="preserve">“forming”</w:t>
-            </w:r>
-            <w:r>
-              <w:t xml:space="preserve"> </w:t>
-            </w:r>
-            <w:r>
-              <w:t xml:space="preserve">draft before that).</w:t>
+              <w:t xml:space="preserve">monogram’s gold frame shows from the start (muted draft) and brightens once all four are in</w:t>
+            </w:r>
+            <w:r>
+              <w:t xml:space="preserve"> </w:t>
+            </w:r>
+            <w:r>
+              <w:t xml:space="preserve">(gentle pop +</w:t>
+            </w:r>
+            <w:r>
+              <w:t xml:space="preserve"> </w:t>
+            </w:r>
+            <w:r>
+              <w:t xml:space="preserve">“✦ Your monogram”</w:t>
+            </w:r>
+            <w:r>
+              <w:t xml:space="preserve"> </w:t>
+            </w:r>
+            <w:r>
+              <w:t xml:space="preserve">caption).</w:t>
             </w:r>
           </w:p>
         </w:tc>
@@ -2124,17 +2124,7 @@
               <w:pStyle w:val="Compact"/>
             </w:pPr>
             <w:r>
-              <w:rPr>
-                <w:b/>
-                <w:bCs/>
-              </w:rPr>
-              <w:t xml:space="preserve">transient search scope, not stored</w:t>
-            </w:r>
-            <w:r>
-              <w:t xml:space="preserve"> </w:t>
-            </w:r>
-            <w:r>
-              <w:t xml:space="preserve">— couple picks</w:t>
+              <w:t xml:space="preserve">couple picks</w:t>
             </w:r>
             <w:r>
               <w:t xml:space="preserve"> </w:t>
@@ -2163,7 +2153,26 @@
               <w:t xml:space="preserve">search for a reception venue</w:t>
             </w:r>
             <w:r>
-              <w:t xml:space="preserve">; the stored anchor is the</w:t>
+              <w:t xml:space="preserve"> </w:t>
+            </w:r>
+            <w:r>
+              <w:t xml:space="preserve">AND as the</w:t>
+            </w:r>
+            <w:r>
+              <w:t xml:space="preserve"> </w:t>
+            </w:r>
+            <w:r>
+              <w:rPr>
+                <w:b/>
+                <w:bCs/>
+              </w:rPr>
+              <w:t xml:space="preserve">Phase-1 working anchor</w:t>
+            </w:r>
+            <w:r>
+              <w:t xml:space="preserve"> </w:t>
+            </w:r>
+            <w:r>
+              <w:t xml:space="preserve">(the area’s city centroid drives location filtering while no venue is locked); the stored anchor is the</w:t>
             </w:r>
             <w:r>
               <w:t xml:space="preserve"> </w:t>
@@ -2226,10 +2235,55 @@
                 <w:b/>
                 <w:bCs/>
               </w:rPr>
-              <w:t xml:space="preserve">scopes the reception-venue search</w:t>
-            </w:r>
-            <w:r>
-              <w:t xml:space="preserve">; vendor distance matching then anchors on the chosen reception coords (Vendor_Match §2a/§2b)</w:t>
+              <w:t xml:space="preserve">Phase 1:</w:t>
+            </w:r>
+            <w:r>
+              <w:t xml:space="preserve"> </w:t>
+            </w:r>
+            <w:r>
+              <w:t xml:space="preserve">area centroid = location filter (always-on, even pre-venue).</w:t>
+            </w:r>
+            <w:r>
+              <w:t xml:space="preserve"> </w:t>
+            </w:r>
+            <w:r>
+              <w:rPr>
+                <w:b/>
+                <w:bCs/>
+              </w:rPr>
+              <w:t xml:space="preserve">Phase 2:</w:t>
+            </w:r>
+            <w:r>
+              <w:t xml:space="preserve"> </w:t>
+            </w:r>
+            <w:r>
+              <w:rPr>
+                <w:b/>
+                <w:bCs/>
+              </w:rPr>
+              <w:t xml:space="preserve">realigns</w:t>
+            </w:r>
+            <w:r>
+              <w:t xml:space="preserve"> </w:t>
+            </w:r>
+            <w:r>
+              <w:t xml:space="preserve">to the chosen reception coords once locked.</w:t>
+            </w:r>
+            <w:r>
+              <w:t xml:space="preserve"> </w:t>
+            </w:r>
+            <w:r>
+              <w:rPr>
+                <w:b/>
+                <w:bCs/>
+              </w:rPr>
+              <w:t xml:space="preserve">Phase 3 (shortlist):</w:t>
+            </w:r>
+            <w:r>
+              <w:t xml:space="preserve"> </w:t>
+            </w:r>
+            <w:r>
+              <w:t xml:space="preserve">vendors labeled with which area/venue they’re nearest to. (Vendor_Match §2a/§2b)</w:t>
             </w:r>
           </w:p>
         </w:tc>
@@ -4299,7 +4353,7 @@
           <w:i/>
           <w:iCs/>
         </w:rPr>
-        <w:t xml:space="preserve">generates once all four are in</w:t>
+        <w:t xml:space="preserve">shows a muted draft frame from the start, brightens once all four are in</w:t>
       </w:r>
       <w:r>
         <w:rPr>
@@ -4329,7 +4383,7 @@
           <w:i/>
           <w:iCs/>
         </w:rPr>
-        <w:t xml:space="preserve">luxurious gold frames</w:t>
+        <w:t xml:space="preserve">luxurious recolorable SVG frames</w:t>
       </w:r>
       <w:r>
         <w:rPr>
@@ -4343,7 +4397,7 @@
           <w:i/>
           <w:iCs/>
         </w:rPr>
-        <w:t xml:space="preserve">· tap Frame/Font ·</w:t>
+        <w:t xml:space="preserve">· tap the monogram to restyle (curated combos) ·</w:t>
       </w:r>
       <w:r>
         <w:rPr>
@@ -6422,7 +6476,7 @@
           <w:b/>
           <w:bCs/>
         </w:rPr>
-        <w:t xml:space="preserve">4 luxurious gold monogram frames</w:t>
+        <w:t xml:space="preserve">4 premium hand-built gold monogram frames</w:t>
       </w:r>
       <w:r>
         <w:t xml:space="preserve"> </w:t>
@@ -6431,13 +6485,13 @@
         <w:rPr>
           <w:rStyle w:val="VerbatimChar"/>
         </w:rPr>
-        <w:t xml:space="preserve">assets/mono/{wreath,crest,square,oval}.webp</w:t>
-      </w:r>
-      <w:r>
-        <w:t xml:space="preserve"> </w:t>
-      </w:r>
-      <w:r>
-        <w:t xml:space="preserve">(the initials overlay live in</w:t>
+        <w:t xml:space="preserve">assets/mono/{wreath,crest,square,oval}.svg</w:t>
+      </w:r>
+      <w:r>
+        <w:t xml:space="preserve"> </w:t>
+      </w:r>
+      <w:r>
+        <w:t xml:space="preserve">(vector SVG · inlined as data-URIs · the initials overlay live in</w:t>
       </w:r>
       <w:r>
         <w:t xml:space="preserve"> </w:t>
@@ -7870,21 +7924,340 @@
                 <w:b/>
                 <w:bCs/>
               </w:rPr>
-              <w:t xml:space="preserve">Tap-to-restyle (owner 2026-06-01</w:t>
-            </w:r>
-            <w:r>
-              <w:rPr>
-                <w:b/>
-                <w:bCs/>
-              </w:rPr>
-              <w:t xml:space="preserve"> </w:t>
-            </w:r>
-            <w:r>
-              <w:rPr>
-                <w:b/>
-                <w:bCs/>
-              </w:rPr>
-              <w:t xml:space="preserve">“let them change the frame and font with a tap · so 2 buttons to change”</w:t>
+              <w:t xml:space="preserve">Tap-to-REGENERATE · no controls (owner 2026-06-04 · supersedes the 2026-06-01 Frame/Font two-button restyle):</w:t>
+            </w:r>
+            <w:r>
+              <w:t xml:space="preserve"> </w:t>
+            </w:r>
+            <w:r>
+              <w:t xml:space="preserve">the</w:t>
+            </w:r>
+            <w:r>
+              <w:t xml:space="preserve"> </w:t>
+            </w:r>
+            <w:r>
+              <w:rPr>
+                <w:b/>
+                <w:bCs/>
+              </w:rPr>
+              <w:t xml:space="preserve">Frame + Font buttons are removed</w:t>
+            </w:r>
+            <w:r>
+              <w:t xml:space="preserve"> </w:t>
+            </w:r>
+            <w:r>
+              <w:t xml:space="preserve">— the couple</w:t>
+            </w:r>
+            <w:r>
+              <w:t xml:space="preserve"> </w:t>
+            </w:r>
+            <w:r>
+              <w:rPr>
+                <w:b/>
+                <w:bCs/>
+              </w:rPr>
+              <w:t xml:space="preserve">taps the medallion to regenerate</w:t>
+            </w:r>
+            <w:r>
+              <w:t xml:space="preserve">, cycling the next</w:t>
+            </w:r>
+            <w:r>
+              <w:t xml:space="preserve"> </w:t>
+            </w:r>
+            <w:r>
+              <w:rPr>
+                <w:b/>
+                <w:bCs/>
+              </w:rPr>
+              <w:t xml:space="preserve">curated combination</w:t>
+            </w:r>
+            <w:r>
+              <w:t xml:space="preserve">; a muted</w:t>
+            </w:r>
+            <w:r>
+              <w:t xml:space="preserve"> </w:t>
+            </w:r>
+            <w:r>
+              <w:t xml:space="preserve">“↻ Tap the monogram for another style”</w:t>
+            </w:r>
+            <w:r>
+              <w:t xml:space="preserve"> </w:t>
+            </w:r>
+            <w:r>
+              <w:t xml:space="preserve">hint sits where the buttons were. The</w:t>
+            </w:r>
+            <w:r>
+              <w:t xml:space="preserve"> </w:t>
+            </w:r>
+            <w:r>
+              <w:rPr>
+                <w:b/>
+                <w:bCs/>
+              </w:rPr>
+              <w:t xml:space="preserve">app picks the pairing</w:t>
+            </w:r>
+            <w:r>
+              <w:t xml:space="preserve"> </w:t>
+            </w:r>
+            <w:r>
+              <w:t xml:space="preserve">(frame + font + colours) so every result is a strategically good-looking, on-brand combination — no choice-overload.</w:t>
+            </w:r>
+            <w:r>
+              <w:t xml:space="preserve"> </w:t>
+            </w:r>
+            <w:r>
+              <w:rPr>
+                <w:b/>
+                <w:bCs/>
+              </w:rPr>
+              <w:t xml:space="preserve">LUXURIOUS frames (owner 2026-06-01</w:t>
+            </w:r>
+            <w:r>
+              <w:rPr>
+                <w:b/>
+                <w:bCs/>
+              </w:rPr>
+              <w:t xml:space="preserve"> </w:t>
+            </w:r>
+            <w:r>
+              <w:rPr>
+                <w:b/>
+                <w:bCs/>
+              </w:rPr>
+              <w:t xml:space="preserve">“we want frames that would look premium for the guests · the letter need to fit properly inside the frame”</w:t>
+            </w:r>
+            <w:r>
+              <w:rPr>
+                <w:b/>
+                <w:bCs/>
+              </w:rPr>
+              <w:t xml:space="preserve"> </w:t>
+            </w:r>
+            <w:r>
+              <w:rPr>
+                <w:b/>
+                <w:bCs/>
+              </w:rPr>
+              <w:t xml:space="preserve">+ 5 ornate-gold reference frames):</w:t>
+            </w:r>
+            <w:r>
+              <w:t xml:space="preserve"> </w:t>
+            </w:r>
+            <w:r>
+              <w:t xml:space="preserve">the 4 frames are</w:t>
+            </w:r>
+            <w:r>
+              <w:t xml:space="preserve"> </w:t>
+            </w:r>
+            <w:r>
+              <w:rPr>
+                <w:b/>
+                <w:bCs/>
+              </w:rPr>
+              <w:t xml:space="preserve">premium hand-built wedding frames</w:t>
+            </w:r>
+            <w:r>
+              <w:t xml:space="preserve"> </w:t>
+            </w:r>
+            <w:r>
+              <w:t xml:space="preserve">(</w:t>
+            </w:r>
+            <w:r>
+              <w:rPr>
+                <w:b/>
+                <w:bCs/>
+              </w:rPr>
+              <w:t xml:space="preserve">inline vector SVG</w:t>
+            </w:r>
+            <w:r>
+              <w:t xml:space="preserve"> </w:t>
+            </w:r>
+            <w:r>
+              <w:t xml:space="preserve">· perfectly symmetric ·</w:t>
+            </w:r>
+            <w:r>
+              <w:t xml:space="preserve"> </w:t>
+            </w:r>
+            <w:r>
+              <w:rPr>
+                <w:b/>
+                <w:bCs/>
+              </w:rPr>
+              <w:t xml:space="preserve">flat — no shadow, no gradient ·</w:t>
+            </w:r>
+            <w:r>
+              <w:rPr>
+                <w:b/>
+                <w:bCs/>
+              </w:rPr>
+              <w:t xml:space="preserve"> </w:t>
+            </w:r>
+            <w:r>
+              <w:rPr>
+                <w:b/>
+                <w:bCs/>
+              </w:rPr>
+              <w:t xml:space="preserve">“just design”</w:t>
+            </w:r>
+            <w:r>
+              <w:t xml:space="preserve"> </w:t>
+            </w:r>
+            <w:r>
+              <w:t xml:space="preserve">(owner 2026-06-04) ·</w:t>
+            </w:r>
+            <w:r>
+              <w:t xml:space="preserve"> </w:t>
+            </w:r>
+            <w:r>
+              <w:rPr>
+                <w:b/>
+                <w:bCs/>
+              </w:rPr>
+              <w:t xml:space="preserve">recolorable</w:t>
+            </w:r>
+            <w:r>
+              <w:t xml:space="preserve">: every line/fill is class-coloured from the active combo via</w:t>
+            </w:r>
+            <w:r>
+              <w:t xml:space="preserve"> </w:t>
+            </w:r>
+            <w:r>
+              <w:rPr>
+                <w:rStyle w:val="VerbatimChar"/>
+              </w:rPr>
+              <w:t xml:space="preserve">--fc</w:t>
+            </w:r>
+            <w:r>
+              <w:t xml:space="preserve">/</w:t>
+            </w:r>
+            <w:r>
+              <w:rPr>
+                <w:rStyle w:val="VerbatimChar"/>
+              </w:rPr>
+              <w:t xml:space="preserve">--fc2</w:t>
+            </w:r>
+            <w:r>
+              <w:t xml:space="preserve">, so the</w:t>
+            </w:r>
+            <w:r>
+              <w:t xml:space="preserve"> </w:t>
+            </w:r>
+            <w:r>
+              <w:rPr>
+                <w:b/>
+                <w:bCs/>
+              </w:rPr>
+              <w:t xml:space="preserve">frame colour is paired to complement the initials</w:t>
+            </w:r>
+            <w:r>
+              <w:t xml:space="preserve"> </w:t>
+            </w:r>
+            <w:r>
+              <w:t xml:space="preserve">(gold ⟷ mulberry ⟷ obsidian duos from the brand palette) · clear center holds the initials · crisp at any size ·</w:t>
+            </w:r>
+            <w:r>
+              <w:t xml:space="preserve"> </w:t>
+            </w:r>
+            <w:r>
+              <w:rPr>
+                <w:rStyle w:val="VerbatimChar"/>
+              </w:rPr>
+              <w:t xml:space="preserve">assets/mono/{wreath,crest,square,oval}.svg</w:t>
+            </w:r>
+            <w:r>
+              <w:t xml:space="preserve">) cycling</w:t>
+            </w:r>
+            <w:r>
+              <w:t xml:space="preserve"> </w:t>
+            </w:r>
+            <w:r>
+              <w:rPr>
+                <w:b/>
+                <w:bCs/>
+              </w:rPr>
+              <w:t xml:space="preserve">round floral wreath → crowned heraldic crest → art-deco gold border → ornate oval cartouche</w:t>
+            </w:r>
+            <w:r>
+              <w:t xml:space="preserve"> </w:t>
+            </w:r>
+            <w:r>
+              <w:t xml:space="preserve">(the crest honors the interlocked-rings-with-crowns reference). The initials render</w:t>
+            </w:r>
+            <w:r>
+              <w:t xml:space="preserve"> </w:t>
+            </w:r>
+            <w:r>
+              <w:rPr>
+                <w:b/>
+                <w:bCs/>
+              </w:rPr>
+              <w:t xml:space="preserve">inside each frame’s clear center</w:t>
+            </w:r>
+            <w:r>
+              <w:t xml:space="preserve"> </w:t>
+            </w:r>
+            <w:r>
+              <w:t xml:space="preserve">(on the paper, since the center is transparent) in</w:t>
+            </w:r>
+            <w:r>
+              <w:t xml:space="preserve"> </w:t>
+            </w:r>
+            <w:r>
+              <w:rPr>
+                <w:rStyle w:val="VerbatimChar"/>
+              </w:rPr>
+              <w:t xml:space="preserve">.mono-letters</w:t>
+            </w:r>
+            <w:r>
+              <w:t xml:space="preserve"> </w:t>
+            </w:r>
+            <w:r>
+              <w:t xml:space="preserve">(the crest’s center sits below the crown → letters nudged down</w:t>
+            </w:r>
+            <w:r>
+              <w:t xml:space="preserve"> </w:t>
+            </w:r>
+            <w:r>
+              <w:rPr>
+                <w:rStyle w:val="VerbatimChar"/>
+              </w:rPr>
+              <w:t xml:space="preserve">translateY(11%)</w:t>
+            </w:r>
+            <w:r>
+              <w:t xml:space="preserve">); sizes tuned so even the widest case (</w:t>
+            </w:r>
+            <w:r>
+              <w:t xml:space="preserve">“M &amp; J”</w:t>
+            </w:r>
+            <w:r>
+              <w:t xml:space="preserve"> </w:t>
+            </w:r>
+            <w:r>
+              <w:t xml:space="preserve">in script) fits the narrowest frame (oval/crest ~79px clear) — verified across all 4 frames × 4 fonts.</w:t>
+            </w:r>
+            <w:r>
+              <w:t xml:space="preserve"> </w:t>
+            </w:r>
+            <w:r>
+              <w:rPr>
+                <w:b/>
+                <w:bCs/>
+              </w:rPr>
+              <w:t xml:space="preserve">PREMIUM-only fonts (owner 2026-06-01</w:t>
+            </w:r>
+            <w:r>
+              <w:rPr>
+                <w:b/>
+                <w:bCs/>
+              </w:rPr>
+              <w:t xml:space="preserve"> </w:t>
+            </w:r>
+            <w:r>
+              <w:rPr>
+                <w:b/>
+                <w:bCs/>
+              </w:rPr>
+              <w:t xml:space="preserve">“we will never offer basic fonts even if this is for free · that is fine”</w:t>
             </w:r>
             <w:r>
               <w:rPr>
@@ -7897,127 +8270,129 @@
               <w:t xml:space="preserve"> </w:t>
             </w:r>
             <w:r>
-              <w:t xml:space="preserve">two pill buttons in the tapzone —</w:t>
-            </w:r>
-            <w:r>
-              <w:t xml:space="preserve"> </w:t>
-            </w:r>
-            <w:r>
-              <w:rPr>
-                <w:b/>
-                <w:bCs/>
-              </w:rPr>
-              <w:t xml:space="preserve">Frame</w:t>
-            </w:r>
-            <w:r>
-              <w:t xml:space="preserve"> </w:t>
-            </w:r>
-            <w:r>
-              <w:t xml:space="preserve">+</w:t>
-            </w:r>
-            <w:r>
-              <w:t xml:space="preserve"> </w:t>
-            </w:r>
-            <w:r>
-              <w:rPr>
-                <w:b/>
-                <w:bCs/>
-              </w:rPr>
-              <w:t xml:space="preserve">Font</w:t>
-            </w:r>
-            <w:r>
-              <w:t xml:space="preserve"> </w:t>
-            </w:r>
-            <w:r>
-              <w:t xml:space="preserve">— restyle the medallion live (preview in the viewzone · controls in the tapzone, matching the budget/pax tap→preview pattern).</w:t>
-            </w:r>
-            <w:r>
-              <w:t xml:space="preserve"> </w:t>
-            </w:r>
-            <w:r>
-              <w:rPr>
-                <w:b/>
-                <w:bCs/>
-              </w:rPr>
-              <w:t xml:space="preserve">LUXURIOUS frames (owner 2026-06-01</w:t>
-            </w:r>
-            <w:r>
-              <w:rPr>
-                <w:b/>
-                <w:bCs/>
-              </w:rPr>
-              <w:t xml:space="preserve"> </w:t>
-            </w:r>
-            <w:r>
-              <w:rPr>
-                <w:b/>
-                <w:bCs/>
-              </w:rPr>
-              <w:t xml:space="preserve">“we want frames that would look premium for the guests · the letter need to fit properly inside the frame”</w:t>
-            </w:r>
-            <w:r>
-              <w:rPr>
-                <w:b/>
-                <w:bCs/>
-              </w:rPr>
-              <w:t xml:space="preserve"> </w:t>
-            </w:r>
-            <w:r>
-              <w:rPr>
-                <w:b/>
-                <w:bCs/>
-              </w:rPr>
-              <w:t xml:space="preserve">+ 5 ornate-gold reference frames):</w:t>
-            </w:r>
-            <w:r>
-              <w:t xml:space="preserve"> </w:t>
-            </w:r>
-            <w:r>
-              <w:t xml:space="preserve">the 4 frames are</w:t>
-            </w:r>
-            <w:r>
-              <w:t xml:space="preserve"> </w:t>
-            </w:r>
-            <w:r>
-              <w:rPr>
-                <w:b/>
-                <w:bCs/>
-              </w:rPr>
-              <w:t xml:space="preserve">real ornamental gold wedding frames</w:t>
-            </w:r>
-            <w:r>
-              <w:t xml:space="preserve"> </w:t>
-            </w:r>
-            <w:r>
-              <w:t xml:space="preserve">(Recraft-generated ·</w:t>
-            </w:r>
-            <w:r>
-              <w:t xml:space="preserve"> </w:t>
-            </w:r>
-            <w:r>
-              <w:rPr>
-                <w:b/>
-                <w:bCs/>
-              </w:rPr>
-              <w:t xml:space="preserve">transparent background</w:t>
-            </w:r>
-            <w:r>
-              <w:t xml:space="preserve"> </w:t>
-            </w:r>
-            <w:r>
-              <w:t xml:space="preserve">— owner 2026-06-01</w:t>
-            </w:r>
-            <w:r>
-              <w:t xml:space="preserve"> </w:t>
-            </w:r>
-            <w:r>
-              <w:t xml:space="preserve">“frames need to have transparent background”</w:t>
-            </w:r>
-            <w:r>
-              <w:t xml:space="preserve"> </w:t>
-            </w:r>
-            <w:r>
-              <w:t xml:space="preserve">→ the ivory ground was keyed out so only the gold filigree shows, sitting directly on the cream paper, clear center transparent too ·</w:t>
+              <w:rPr>
+                <w:b/>
+                <w:bCs/>
+              </w:rPr>
+              <w:t xml:space="preserve">Cormorant Garamond italic · Cinzel engraved caps · Playfair Display italic · Great Vibes calligraphy script</w:t>
+            </w:r>
+            <w:r>
+              <w:t xml:space="preserve"> </w:t>
+            </w:r>
+            <w:r>
+              <w:t xml:space="preserve">—</w:t>
+            </w:r>
+            <w:r>
+              <w:t xml:space="preserve"> </w:t>
+            </w:r>
+            <w:r>
+              <w:rPr>
+                <w:b/>
+                <w:bCs/>
+              </w:rPr>
+              <w:t xml:space="preserve">DM Mono dropped</w:t>
+            </w:r>
+            <w:r>
+              <w:t xml:space="preserve"> </w:t>
+            </w:r>
+            <w:r>
+              <w:t xml:space="preserve">(basic). Frames + 3 web-fonts are warmed on first load (Rule 7). This is a small</w:t>
+            </w:r>
+            <w:r>
+              <w:t xml:space="preserve"> </w:t>
+            </w:r>
+            <w:r>
+              <w:rPr>
+                <w:b/>
+                <w:bCs/>
+              </w:rPr>
+              <w:t xml:space="preserve">free</w:t>
+            </w:r>
+            <w:r>
+              <w:t xml:space="preserve"> </w:t>
+            </w:r>
+            <w:r>
+              <w:t xml:space="preserve">set; the</w:t>
+            </w:r>
+            <w:r>
+              <w:t xml:space="preserve"> </w:t>
+            </w:r>
+            <w:r>
+              <w:rPr>
+                <w:b/>
+                <w:bCs/>
+              </w:rPr>
+              <w:t xml:space="preserve">deeper premium frame/font library + Animated/Bespoke</w:t>
+            </w:r>
+            <w:r>
+              <w:t xml:space="preserve"> </w:t>
+            </w:r>
+            <w:r>
+              <w:t xml:space="preserve">stay the paid upgrade (0004 Pro Hero / 0037 Bespoke) — the dashboard Website editor + the Today’s Focus</w:t>
+            </w:r>
+            <w:r>
+              <w:t xml:space="preserve"> </w:t>
+            </w:r>
+            <w:r>
+              <w:rPr>
+                <w:b/>
+                <w:bCs/>
+              </w:rPr>
+              <w:t xml:space="preserve">“Design Monogram”</w:t>
+            </w:r>
+            <w:r>
+              <w:t xml:space="preserve"> </w:t>
+            </w:r>
+            <w:r>
+              <w:t xml:space="preserve">card. No new SKU; no scroll (665/665 · verified).</w:t>
+            </w:r>
+            <w:r>
+              <w:t xml:space="preserve"> </w:t>
+            </w:r>
+            <w:r>
+              <w:rPr>
+                <w:b/>
+                <w:bCs/>
+              </w:rPr>
+              <w:t xml:space="preserve">Four fields · Enter-to-advance · generate-on-complete (owner 2026-06-04):</w:t>
+            </w:r>
+            <w:r>
+              <w:t xml:space="preserve"> </w:t>
+            </w:r>
+            <w:r>
+              <w:t xml:space="preserve">the screen captures</w:t>
+            </w:r>
+            <w:r>
+              <w:t xml:space="preserve"> </w:t>
+            </w:r>
+            <w:r>
+              <w:rPr>
+                <w:b/>
+                <w:bCs/>
+              </w:rPr>
+              <w:t xml:space="preserve">Bride first + last</w:t>
+            </w:r>
+            <w:r>
+              <w:t xml:space="preserve"> </w:t>
+            </w:r>
+            <w:r>
+              <w:t xml:space="preserve">and</w:t>
+            </w:r>
+            <w:r>
+              <w:t xml:space="preserve"> </w:t>
+            </w:r>
+            <w:r>
+              <w:rPr>
+                <w:b/>
+                <w:bCs/>
+              </w:rPr>
+              <w:t xml:space="preserve">Groom first + last</w:t>
+            </w:r>
+            <w:r>
+              <w:t xml:space="preserve"> </w:t>
+            </w:r>
+            <w:r>
+              <w:t xml:space="preserve">as four fields (2×2 grid ·</w:t>
             </w:r>
             <w:r>
               <w:t xml:space="preserve"> </w:t>
@@ -8026,248 +8401,6 @@
               <w:rPr>
                 <w:rStyle w:val="VerbatimChar"/>
               </w:rPr>
-              <w:t xml:space="preserve">assets/mono/{wreath,crest,square,oval}.webp</w:t>
-            </w:r>
-            <w:r>
-              <w:t xml:space="preserve"> </w:t>
-            </w:r>
-            <w:r>
-              <w:t xml:space="preserve">RGBA) cycling</w:t>
-            </w:r>
-            <w:r>
-              <w:t xml:space="preserve"> </w:t>
-            </w:r>
-            <w:r>
-              <w:rPr>
-                <w:b/>
-                <w:bCs/>
-              </w:rPr>
-              <w:t xml:space="preserve">round floral wreath → crowned heraldic crest → art-deco gold border → ornate oval cartouche</w:t>
-            </w:r>
-            <w:r>
-              <w:t xml:space="preserve"> </w:t>
-            </w:r>
-            <w:r>
-              <w:t xml:space="preserve">(the crest honors the interlocked-rings-with-crowns reference). The initials render</w:t>
-            </w:r>
-            <w:r>
-              <w:t xml:space="preserve"> </w:t>
-            </w:r>
-            <w:r>
-              <w:rPr>
-                <w:b/>
-                <w:bCs/>
-              </w:rPr>
-              <w:t xml:space="preserve">inside each frame’s clear center</w:t>
-            </w:r>
-            <w:r>
-              <w:t xml:space="preserve"> </w:t>
-            </w:r>
-            <w:r>
-              <w:t xml:space="preserve">(on the paper, since the center is transparent) in</w:t>
-            </w:r>
-            <w:r>
-              <w:t xml:space="preserve"> </w:t>
-            </w:r>
-            <w:r>
-              <w:rPr>
-                <w:rStyle w:val="VerbatimChar"/>
-              </w:rPr>
-              <w:t xml:space="preserve">.mono-letters</w:t>
-            </w:r>
-            <w:r>
-              <w:t xml:space="preserve"> </w:t>
-            </w:r>
-            <w:r>
-              <w:t xml:space="preserve">(the crest’s center sits below the crown → letters nudged down</w:t>
-            </w:r>
-            <w:r>
-              <w:t xml:space="preserve"> </w:t>
-            </w:r>
-            <w:r>
-              <w:rPr>
-                <w:rStyle w:val="VerbatimChar"/>
-              </w:rPr>
-              <w:t xml:space="preserve">translateY(11%)</w:t>
-            </w:r>
-            <w:r>
-              <w:t xml:space="preserve">); sizes tuned so even the widest case (</w:t>
-            </w:r>
-            <w:r>
-              <w:t xml:space="preserve">“M &amp; J”</w:t>
-            </w:r>
-            <w:r>
-              <w:t xml:space="preserve"> </w:t>
-            </w:r>
-            <w:r>
-              <w:t xml:space="preserve">in script) fits the narrowest frame (oval/crest ~79px clear) — verified across all 4 frames × 4 fonts.</w:t>
-            </w:r>
-            <w:r>
-              <w:t xml:space="preserve"> </w:t>
-            </w:r>
-            <w:r>
-              <w:rPr>
-                <w:b/>
-                <w:bCs/>
-              </w:rPr>
-              <w:t xml:space="preserve">PREMIUM-only fonts (owner 2026-06-01</w:t>
-            </w:r>
-            <w:r>
-              <w:rPr>
-                <w:b/>
-                <w:bCs/>
-              </w:rPr>
-              <w:t xml:space="preserve"> </w:t>
-            </w:r>
-            <w:r>
-              <w:rPr>
-                <w:b/>
-                <w:bCs/>
-              </w:rPr>
-              <w:t xml:space="preserve">“we will never offer basic fonts even if this is for free · that is fine”</w:t>
-            </w:r>
-            <w:r>
-              <w:rPr>
-                <w:b/>
-                <w:bCs/>
-              </w:rPr>
-              <w:t xml:space="preserve">):</w:t>
-            </w:r>
-            <w:r>
-              <w:t xml:space="preserve"> </w:t>
-            </w:r>
-            <w:r>
-              <w:rPr>
-                <w:b/>
-                <w:bCs/>
-              </w:rPr>
-              <w:t xml:space="preserve">Cormorant Garamond italic · Cinzel engraved caps · Playfair Display italic · Great Vibes calligraphy script</w:t>
-            </w:r>
-            <w:r>
-              <w:t xml:space="preserve"> </w:t>
-            </w:r>
-            <w:r>
-              <w:t xml:space="preserve">—</w:t>
-            </w:r>
-            <w:r>
-              <w:t xml:space="preserve"> </w:t>
-            </w:r>
-            <w:r>
-              <w:rPr>
-                <w:b/>
-                <w:bCs/>
-              </w:rPr>
-              <w:t xml:space="preserve">DM Mono dropped</w:t>
-            </w:r>
-            <w:r>
-              <w:t xml:space="preserve"> </w:t>
-            </w:r>
-            <w:r>
-              <w:t xml:space="preserve">(basic). Frames + 3 web-fonts are warmed on first load (Rule 7). This is a small</w:t>
-            </w:r>
-            <w:r>
-              <w:t xml:space="preserve"> </w:t>
-            </w:r>
-            <w:r>
-              <w:rPr>
-                <w:b/>
-                <w:bCs/>
-              </w:rPr>
-              <w:t xml:space="preserve">free</w:t>
-            </w:r>
-            <w:r>
-              <w:t xml:space="preserve"> </w:t>
-            </w:r>
-            <w:r>
-              <w:t xml:space="preserve">set; the</w:t>
-            </w:r>
-            <w:r>
-              <w:t xml:space="preserve"> </w:t>
-            </w:r>
-            <w:r>
-              <w:rPr>
-                <w:b/>
-                <w:bCs/>
-              </w:rPr>
-              <w:t xml:space="preserve">deeper premium frame/font library + Animated/Bespoke</w:t>
-            </w:r>
-            <w:r>
-              <w:t xml:space="preserve"> </w:t>
-            </w:r>
-            <w:r>
-              <w:t xml:space="preserve">stay the paid upgrade (0004 Pro Hero / 0037 Bespoke) — the dashboard Website editor + the Today’s Focus</w:t>
-            </w:r>
-            <w:r>
-              <w:t xml:space="preserve"> </w:t>
-            </w:r>
-            <w:r>
-              <w:rPr>
-                <w:b/>
-                <w:bCs/>
-              </w:rPr>
-              <w:t xml:space="preserve">“Design Monogram”</w:t>
-            </w:r>
-            <w:r>
-              <w:t xml:space="preserve"> </w:t>
-            </w:r>
-            <w:r>
-              <w:t xml:space="preserve">card. No new SKU; no scroll (665/665 · verified).</w:t>
-            </w:r>
-            <w:r>
-              <w:t xml:space="preserve"> </w:t>
-            </w:r>
-            <w:r>
-              <w:rPr>
-                <w:b/>
-                <w:bCs/>
-              </w:rPr>
-              <w:t xml:space="preserve">Four fields · Enter-to-advance · generate-on-complete (owner 2026-06-04):</w:t>
-            </w:r>
-            <w:r>
-              <w:t xml:space="preserve"> </w:t>
-            </w:r>
-            <w:r>
-              <w:t xml:space="preserve">the screen captures</w:t>
-            </w:r>
-            <w:r>
-              <w:t xml:space="preserve"> </w:t>
-            </w:r>
-            <w:r>
-              <w:rPr>
-                <w:b/>
-                <w:bCs/>
-              </w:rPr>
-              <w:t xml:space="preserve">Bride first + last</w:t>
-            </w:r>
-            <w:r>
-              <w:t xml:space="preserve"> </w:t>
-            </w:r>
-            <w:r>
-              <w:t xml:space="preserve">and</w:t>
-            </w:r>
-            <w:r>
-              <w:t xml:space="preserve"> </w:t>
-            </w:r>
-            <w:r>
-              <w:rPr>
-                <w:b/>
-                <w:bCs/>
-              </w:rPr>
-              <w:t xml:space="preserve">Groom first + last</w:t>
-            </w:r>
-            <w:r>
-              <w:t xml:space="preserve"> </w:t>
-            </w:r>
-            <w:r>
-              <w:t xml:space="preserve">as four fields (2×2 grid ·</w:t>
-            </w:r>
-            <w:r>
-              <w:t xml:space="preserve"> </w:t>
-            </w:r>
-            <w:r>
-              <w:rPr>
-                <w:rStyle w:val="VerbatimChar"/>
-              </w:rPr>
               <w:t xml:space="preserve">label · first · last</w:t>
             </w:r>
             <w:r>
@@ -8319,81 +8452,107 @@
               <w:t xml:space="preserve">Enter on Groom last name closes the keyboard</w:t>
             </w:r>
             <w:r>
-              <w:t xml:space="preserve">. The medallion shows a light</w:t>
-            </w:r>
-            <w:r>
-              <w:t xml:space="preserve"> </w:t>
-            </w:r>
-            <w:r>
-              <w:rPr>
-                <w:b/>
-                <w:bCs/>
-              </w:rPr>
-              <w:t xml:space="preserve">“forming”</w:t>
-            </w:r>
-            <w:r>
-              <w:rPr>
-                <w:b/>
-                <w:bCs/>
-              </w:rPr>
-              <w:t xml:space="preserve"> </w:t>
-            </w:r>
-            <w:r>
-              <w:rPr>
-                <w:b/>
-                <w:bCs/>
-              </w:rPr>
-              <w:t xml:space="preserve">draft</w:t>
-            </w:r>
-            <w:r>
-              <w:t xml:space="preserve"> </w:t>
-            </w:r>
-            <w:r>
-              <w:t xml:space="preserve">(muted initials in a dashed ring, no gold frame) as they type, then</w:t>
-            </w:r>
-            <w:r>
-              <w:t xml:space="preserve"> </w:t>
-            </w:r>
-            <w:r>
-              <w:rPr>
-                <w:b/>
-                <w:bCs/>
-              </w:rPr>
-              <w:t xml:space="preserve">generates</w:t>
-            </w:r>
-            <w:r>
-              <w:t xml:space="preserve"> </w:t>
-            </w:r>
-            <w:r>
-              <w:t xml:space="preserve">— gold-frame reveal + a</w:t>
-            </w:r>
-            <w:r>
-              <w:t xml:space="preserve"> </w:t>
-            </w:r>
-            <w:r>
+              <w:t xml:space="preserve">. The gold frame shows</w:t>
+            </w:r>
+            <w:r>
+              <w:t xml:space="preserve"> </w:t>
+            </w:r>
+            <w:r>
+              <w:rPr>
+                <w:b/>
+                <w:bCs/>
+              </w:rPr>
+              <w:t xml:space="preserve">from the start as a muted draft</w:t>
+            </w:r>
+            <w:r>
+              <w:t xml:space="preserve"> </w:t>
+            </w:r>
+            <w:r>
+              <w:t xml:space="preserve">so couples can preview + cycle frame styles while typing (Frame/Font live immediately); once</w:t>
+            </w:r>
+            <w:r>
+              <w:t xml:space="preserve"> </w:t>
+            </w:r>
+            <w:r>
+              <w:rPr>
+                <w:b/>
+                <w:bCs/>
+              </w:rPr>
+              <w:t xml:space="preserve">all four names are entered</w:t>
+            </w:r>
+            <w:r>
+              <w:t xml:space="preserve"> </w:t>
+            </w:r>
+            <w:r>
+              <w:t xml:space="preserve">the mark</w:t>
+            </w:r>
+            <w:r>
+              <w:t xml:space="preserve"> </w:t>
+            </w:r>
+            <w:r>
+              <w:rPr>
+                <w:b/>
+                <w:bCs/>
+              </w:rPr>
+              <w:t xml:space="preserve">brightens to full + a</w:t>
+            </w:r>
+            <w:r>
+              <w:rPr>
+                <w:b/>
+                <w:bCs/>
+              </w:rPr>
+              <w:t xml:space="preserve"> </w:t>
+            </w:r>
+            <w:r>
+              <w:rPr>
+                <w:b/>
+                <w:bCs/>
+              </w:rPr>
               <w:t xml:space="preserve">“✦ Your monogram”</w:t>
             </w:r>
             <w:r>
-              <w:t xml:space="preserve"> </w:t>
-            </w:r>
-            <w:r>
-              <w:t xml:space="preserve">caption + a gentle pop —</w:t>
-            </w:r>
-            <w:r>
-              <w:t xml:space="preserve"> </w:t>
-            </w:r>
-            <w:r>
-              <w:rPr>
-                <w:b/>
-                <w:bCs/>
-              </w:rPr>
-              <w:t xml:space="preserve">once all four names are entered</w:t>
-            </w:r>
-            <w:r>
-              <w:t xml:space="preserve"> </w:t>
-            </w:r>
-            <w:r>
-              <w:t xml:space="preserve">(also fires on Continue if all four are filled). First-name initials still drive the mark (</w:t>
+              <w:rPr>
+                <w:b/>
+                <w:bCs/>
+              </w:rPr>
+              <w:t xml:space="preserve"> </w:t>
+            </w:r>
+            <w:r>
+              <w:rPr>
+                <w:b/>
+                <w:bCs/>
+              </w:rPr>
+              <w:t xml:space="preserve">caption fades in + a gentle pop</w:t>
+            </w:r>
+            <w:r>
+              <w:t xml:space="preserve"> </w:t>
+            </w:r>
+            <w:r>
+              <w:t xml:space="preserve">= the</w:t>
+            </w:r>
+            <w:r>
+              <w:t xml:space="preserve"> </w:t>
+            </w:r>
+            <w:r>
+              <w:t xml:space="preserve">“it’s done”</w:t>
+            </w:r>
+            <w:r>
+              <w:t xml:space="preserve"> </w:t>
+            </w:r>
+            <w:r>
+              <w:t xml:space="preserve">moment (owner 2026-06-04</w:t>
+            </w:r>
+            <w:r>
+              <w:t xml:space="preserve"> </w:t>
+            </w:r>
+            <w:r>
+              <w:t xml:space="preserve">“show while choosing”</w:t>
+            </w:r>
+            <w:r>
+              <w:t xml:space="preserve"> </w:t>
+            </w:r>
+            <w:r>
+              <w:t xml:space="preserve">· supersedes the same-day no-frame-until-complete reveal; also fires on Continue if all four are filled). First-name initials still drive the mark (</w:t>
             </w:r>
             <w:r>
               <w:t xml:space="preserve">“Maria … Juan”</w:t>
@@ -9127,58 +9286,13 @@
                 <w:b/>
                 <w:bCs/>
               </w:rPr>
-              <w:t xml:space="preserve">Top-10 PH wedding-cities CAROUSEL</w:t>
-            </w:r>
-            <w:r>
-              <w:t xml:space="preserve"> </w:t>
-            </w:r>
-            <w:r>
-              <w:t xml:space="preserve">sitting just above the search bar (owner 2026-06-04) — a horizontal scroll-snap strip of</w:t>
-            </w:r>
-            <w:r>
-              <w:t xml:space="preserve"> </w:t>
-            </w:r>
-            <w:r>
-              <w:rPr>
-                <w:b/>
-                <w:bCs/>
-              </w:rPr>
-              <w:t xml:space="preserve">City cards</w:t>
-            </w:r>
-            <w:r>
-              <w:t xml:space="preserve"> </w:t>
-            </w:r>
-            <w:r>
-              <w:t xml:space="preserve">ranked 1–10 (</w:t>
-            </w:r>
-            <w:r>
-              <w:rPr>
-                <w:b/>
-                <w:bCs/>
-              </w:rPr>
-              <w:t xml:space="preserve">Tagaytay · Cebu · Boracay · El Nido · Baguio · Nasugbu · Panglao · Manila · Makati · Vigan</w:t>
-            </w:r>
-            <w:r>
-              <w:t xml:space="preserve"> </w:t>
-            </w:r>
-            <w:r>
-              <w:t xml:space="preserve">— City, not region), each carrying a</w:t>
-            </w:r>
-            <w:r>
-              <w:t xml:space="preserve"> </w:t>
-            </w:r>
-            <w:r>
-              <w:rPr>
-                <w:b/>
-                <w:bCs/>
-              </w:rPr>
-              <w:t xml:space="preserve">per-city wedding nugget</w:t>
-            </w:r>
-            <w:r>
-              <w:t xml:space="preserve"> </w:t>
-            </w:r>
-            <w:r>
-              <w:t xml:space="preserve">(one-line local flavor — e.g. Tagaytay</w:t>
+              <w:t xml:space="preserve">Top-30 PH wedding-cities CAROUSEL</w:t>
+            </w:r>
+            <w:r>
+              <w:t xml:space="preserve"> </w:t>
+            </w:r>
+            <w:r>
+              <w:t xml:space="preserve">sitting just above the search bar (expanded from 10 · owner 2026-06-04</w:t>
             </w:r>
             <w:r>
               <w:t xml:space="preserve"> </w:t>
@@ -9188,175 +9302,55 @@
                 <w:i/>
                 <w:iCs/>
               </w:rPr>
-              <w:t xml:space="preserve">“cool-climate gardens &amp; ridges over Taal”</w:t>
-            </w:r>
-            <w:r>
-              <w:t xml:space="preserve">; production swaps a</w:t>
-            </w:r>
-            <w:r>
-              <w:t xml:space="preserve"> </w:t>
-            </w:r>
-            <w:r>
-              <w:rPr>
-                <w:b/>
-                <w:bCs/>
-              </w:rPr>
-              <w:t xml:space="preserve">real photo per city</w:t>
-            </w:r>
-            <w:r>
-              <w:t xml:space="preserve"> </w:t>
-            </w:r>
-            <w:r>
-              <w:t xml:space="preserve">behind the card scrim, like the pax/budget heroes). The carousel</w:t>
-            </w:r>
-            <w:r>
-              <w:t xml:space="preserve"> </w:t>
-            </w:r>
-            <w:r>
-              <w:rPr>
-                <w:b/>
-                <w:bCs/>
-              </w:rPr>
-              <w:t xml:space="preserve">slides DOWN out of view the moment you start typing, and rises back UP when the box is cleared</w:t>
-            </w:r>
-            <w:r>
-              <w:t xml:space="preserve"> </w:t>
-            </w:r>
-            <w:r>
-              <w:t xml:space="preserve">(owner 2026-06-04 · smooth transform+opacity transition · the results list cross-fades in).</w:t>
-            </w:r>
-            <w:r>
-              <w:t xml:space="preserve"> </w:t>
-            </w:r>
-            <w:r>
-              <w:rPr>
-                <w:b/>
-                <w:bCs/>
-              </w:rPr>
-              <w:t xml:space="preserve">“Near me”</w:t>
-            </w:r>
-            <w:r>
-              <w:t xml:space="preserve"> </w:t>
-            </w:r>
-            <w:r>
-              <w:t xml:space="preserve">reads device GPS (free) and re-sorts</w:t>
-            </w:r>
-            <w:r>
-              <w:t xml:space="preserve"> </w:t>
-            </w:r>
-            <w:r>
-              <w:rPr>
-                <w:b/>
-                <w:bCs/>
-              </w:rPr>
-              <w:t xml:space="preserve">nearest-first</w:t>
-            </w:r>
-            <w:r>
-              <w:t xml:space="preserve"> </w:t>
-            </w:r>
-            <w:r>
-              <w:t xml:space="preserve">with</w:t>
-            </w:r>
-            <w:r>
-              <w:t xml:space="preserve"> </w:t>
-            </w:r>
-            <w:r>
-              <w:rPr>
-                <w:rStyle w:val="VerbatimChar"/>
-              </w:rPr>
-              <w:t xml:space="preserve">· N km</w:t>
-            </w:r>
-            <w:r>
-              <w:t xml:space="preserve"> </w:t>
-            </w:r>
-            <w:r>
-              <w:t xml:space="preserve">hints (haversine);</w:t>
-            </w:r>
-            <w:r>
-              <w:t xml:space="preserve"> </w:t>
-            </w:r>
-            <w:r>
-              <w:rPr>
-                <w:b/>
-                <w:bCs/>
-              </w:rPr>
-              <w:t xml:space="preserve">typing searches EVERY PH locality</w:t>
-            </w:r>
-            <w:r>
-              <w:t xml:space="preserve"> </w:t>
-            </w:r>
-            <w:r>
-              <w:t xml:space="preserve">— the prototype now</w:t>
-            </w:r>
-            <w:r>
-              <w:t xml:space="preserve"> </w:t>
-            </w:r>
-            <w:r>
-              <w:rPr>
-                <w:b/>
-                <w:bCs/>
-              </w:rPr>
-              <w:t xml:space="preserve">bundles the complete PSGC set</w:t>
-            </w:r>
-            <w:r>
-              <w:t xml:space="preserve"> </w:t>
-            </w:r>
-            <w:r>
-              <w:t xml:space="preserve">(</w:t>
-            </w:r>
-            <w:r>
-              <w:rPr>
-                <w:b/>
-                <w:bCs/>
-              </w:rPr>
-              <w:t xml:space="preserve">all 81 provinces + 1,634 cities/municipalities = 1,665 places across all 17 regions</w:t>
-            </w:r>
-            <w:r>
-              <w:t xml:space="preserve">, incl. every archipelagic province — Batanes · Sulu · Tawi-Tawi · Dinagat Islands · Basilan · Guimaras · Marinduque · Siquijor · Romblon · Sarangani — so</w:t>
-            </w:r>
-            <w:r>
-              <w:t xml:space="preserve"> </w:t>
-            </w:r>
-            <w:r>
-              <w:rPr>
-                <w:b/>
-                <w:bCs/>
-              </w:rPr>
-              <w:t xml:space="preserve">no spot in the country is unavailable</w:t>
-            </w:r>
-            <w:r>
-              <w:t xml:space="preserve">, owner 2026-06-04; bundled as</w:t>
-            </w:r>
-            <w:r>
-              <w:t xml:space="preserve"> </w:t>
-            </w:r>
-            <w:r>
-              <w:rPr>
-                <w:rStyle w:val="VerbatimChar"/>
-              </w:rPr>
-              <w:t xml:space="preserve">assets/ph_places.js</w:t>
-            </w:r>
-            <w:r>
-              <w:t xml:space="preserve"> </w:t>
-            </w:r>
-            <w:r>
-              <w:t xml:space="preserve">~80KB on-device · ₱0, no Places API, instant per Golden Rule 7 · graceful Metro-Manila fallback if GPS denied) — swapping the carousel for a</w:t>
-            </w:r>
-            <w:r>
-              <w:t xml:space="preserve"> </w:t>
-            </w:r>
-            <w:r>
-              <w:rPr>
-                <w:b/>
-                <w:bCs/>
-              </w:rPr>
-              <w:t xml:space="preserve">results list, each row with a per-place nugget</w:t>
-            </w:r>
-            <w:r>
-              <w:t xml:space="preserve"> </w:t>
-            </w:r>
-            <w:r>
-              <w:t xml:space="preserve">(curated for the well-known cities · a graceful</w:t>
+              <w:t xml:space="preserve">“do top 30”</w:t>
+            </w:r>
+            <w:r>
+              <w:t xml:space="preserve">) — a horizontal scroll-snap strip of</w:t>
+            </w:r>
+            <w:r>
+              <w:t xml:space="preserve"> </w:t>
+            </w:r>
+            <w:r>
+              <w:rPr>
+                <w:b/>
+                <w:bCs/>
+              </w:rPr>
+              <w:t xml:space="preserve">City cards</w:t>
+            </w:r>
+            <w:r>
+              <w:t xml:space="preserve"> </w:t>
+            </w:r>
+            <w:r>
+              <w:t xml:space="preserve">ranked 1–30 (</w:t>
+            </w:r>
+            <w:r>
+              <w:rPr>
+                <w:b/>
+                <w:bCs/>
+              </w:rPr>
+              <w:t xml:space="preserve">Tagaytay · Cebu · Boracay · El Nido · Baguio · Nasugbu · Panglao · Manila · Makati · Vigan · Quezon City · BGC · Davao · Iloilo · Bacolod · Puerto Princesa · Coron · Siargao · Dumaguete · Bohol · Mactan · Subic · La Union · Clark · Calatagan · Antipolo · Cagayan de Oro · Siquijor · Legazpi · Sagada</w:t>
+            </w:r>
+            <w:r>
+              <w:t xml:space="preserve"> </w:t>
+            </w:r>
+            <w:r>
+              <w:t xml:space="preserve">— City, not region), each with a</w:t>
+            </w:r>
+            <w:r>
+              <w:t xml:space="preserve"> </w:t>
+            </w:r>
+            <w:r>
+              <w:rPr>
+                <w:b/>
+                <w:bCs/>
+              </w:rPr>
+              <w:t xml:space="preserve">per-city wedding nugget</w:t>
+            </w:r>
+            <w:r>
+              <w:t xml:space="preserve"> </w:t>
+            </w:r>
+            <w:r>
+              <w:t xml:space="preserve">(one-line local flavor — e.g. Tagaytay</w:t>
             </w:r>
             <w:r>
               <w:t xml:space="preserve"> </w:t>
@@ -9366,13 +9360,332 @@
                 <w:i/>
                 <w:iCs/>
               </w:rPr>
+              <w:t xml:space="preserve">“cool-climate gardens &amp; ridges over Taal”</w:t>
+            </w:r>
+            <w:r>
+              <w:t xml:space="preserve">) AND a</w:t>
+            </w:r>
+            <w:r>
+              <w:t xml:space="preserve"> </w:t>
+            </w:r>
+            <w:r>
+              <w:rPr>
+                <w:b/>
+                <w:bCs/>
+              </w:rPr>
+              <w:t xml:space="preserve">real generated photo</w:t>
+            </w:r>
+            <w:r>
+              <w:t xml:space="preserve"> </w:t>
+            </w:r>
+            <w:r>
+              <w:t xml:space="preserve">behind the card scrim (</w:t>
+            </w:r>
+            <w:r>
+              <w:rPr>
+                <w:b/>
+                <w:bCs/>
+              </w:rPr>
+              <w:t xml:space="preserve">30 Recraft photos shipped</w:t>
+            </w:r>
+            <w:r>
+              <w:t xml:space="preserve"> </w:t>
+            </w:r>
+            <w:r>
+              <w:t xml:space="preserve">·</w:t>
+            </w:r>
+            <w:r>
+              <w:t xml:space="preserve"> </w:t>
+            </w:r>
+            <w:r>
+              <w:rPr>
+                <w:rStyle w:val="VerbatimChar"/>
+              </w:rPr>
+              <w:t xml:space="preserve">assets/cities/{key}.webp</w:t>
+            </w:r>
+            <w:r>
+              <w:t xml:space="preserve"> </w:t>
+            </w:r>
+            <w:r>
+              <w:t xml:space="preserve">· 428×760 WebP · ~1.2MB total · preloaded per Rule 7). The carousel</w:t>
+            </w:r>
+            <w:r>
+              <w:t xml:space="preserve"> </w:t>
+            </w:r>
+            <w:r>
+              <w:rPr>
+                <w:b/>
+                <w:bCs/>
+              </w:rPr>
+              <w:t xml:space="preserve">slides DOWN out of view the moment you start typing, and rises back UP when the box is cleared</w:t>
+            </w:r>
+            <w:r>
+              <w:t xml:space="preserve"> </w:t>
+            </w:r>
+            <w:r>
+              <w:t xml:space="preserve">(owner 2026-06-04 · smooth transform+opacity transition · the results list cross-fades in).</w:t>
+            </w:r>
+            <w:r>
+              <w:t xml:space="preserve"> </w:t>
+            </w:r>
+            <w:r>
+              <w:rPr>
+                <w:b/>
+                <w:bCs/>
+              </w:rPr>
+              <w:t xml:space="preserve">“Near me”</w:t>
+            </w:r>
+            <w:r>
+              <w:t xml:space="preserve"> </w:t>
+            </w:r>
+            <w:r>
+              <w:t xml:space="preserve">reads device GPS (free) and re-sorts</w:t>
+            </w:r>
+            <w:r>
+              <w:t xml:space="preserve"> </w:t>
+            </w:r>
+            <w:r>
+              <w:rPr>
+                <w:b/>
+                <w:bCs/>
+              </w:rPr>
+              <w:t xml:space="preserve">nearest-first</w:t>
+            </w:r>
+            <w:r>
+              <w:t xml:space="preserve"> </w:t>
+            </w:r>
+            <w:r>
+              <w:t xml:space="preserve">with</w:t>
+            </w:r>
+            <w:r>
+              <w:t xml:space="preserve"> </w:t>
+            </w:r>
+            <w:r>
+              <w:rPr>
+                <w:rStyle w:val="VerbatimChar"/>
+              </w:rPr>
+              <w:t xml:space="preserve">· N km</w:t>
+            </w:r>
+            <w:r>
+              <w:t xml:space="preserve"> </w:t>
+            </w:r>
+            <w:r>
+              <w:t xml:space="preserve">hints (haversine);</w:t>
+            </w:r>
+            <w:r>
+              <w:t xml:space="preserve"> </w:t>
+            </w:r>
+            <w:r>
+              <w:rPr>
+                <w:b/>
+                <w:bCs/>
+              </w:rPr>
+              <w:t xml:space="preserve">typing searches EVERY PH locality</w:t>
+            </w:r>
+            <w:r>
+              <w:t xml:space="preserve"> </w:t>
+            </w:r>
+            <w:r>
+              <w:t xml:space="preserve">— the prototype now</w:t>
+            </w:r>
+            <w:r>
+              <w:t xml:space="preserve"> </w:t>
+            </w:r>
+            <w:r>
+              <w:rPr>
+                <w:b/>
+                <w:bCs/>
+              </w:rPr>
+              <w:t xml:space="preserve">bundles the complete PSGC set</w:t>
+            </w:r>
+            <w:r>
+              <w:t xml:space="preserve"> </w:t>
+            </w:r>
+            <w:r>
+              <w:t xml:space="preserve">(</w:t>
+            </w:r>
+            <w:r>
+              <w:rPr>
+                <w:b/>
+                <w:bCs/>
+              </w:rPr>
+              <w:t xml:space="preserve">all 81 provinces + 1,634 cities/municipalities = 1,665 places across all 17 regions</w:t>
+            </w:r>
+            <w:r>
+              <w:t xml:space="preserve">, incl. every archipelagic province — Batanes · Sulu · Tawi-Tawi · Dinagat Islands · Basilan · Guimaras · Marinduque · Siquijor · Romblon · Sarangani — so</w:t>
+            </w:r>
+            <w:r>
+              <w:t xml:space="preserve"> </w:t>
+            </w:r>
+            <w:r>
+              <w:rPr>
+                <w:b/>
+                <w:bCs/>
+              </w:rPr>
+              <w:t xml:space="preserve">no spot in the country is unavailable</w:t>
+            </w:r>
+            <w:r>
+              <w:t xml:space="preserve">, owner 2026-06-04; bundled as</w:t>
+            </w:r>
+            <w:r>
+              <w:t xml:space="preserve"> </w:t>
+            </w:r>
+            <w:r>
+              <w:rPr>
+                <w:rStyle w:val="VerbatimChar"/>
+              </w:rPr>
+              <w:t xml:space="preserve">assets/ph_places.js</w:t>
+            </w:r>
+            <w:r>
+              <w:t xml:space="preserve"> </w:t>
+            </w:r>
+            <w:r>
+              <w:t xml:space="preserve">~80KB on-device · ₱0, no Places API, instant per Golden Rule 7 · graceful Metro-Manila fallback if GPS denied) — swapping the carousel for a</w:t>
+            </w:r>
+            <w:r>
+              <w:t xml:space="preserve"> </w:t>
+            </w:r>
+            <w:r>
+              <w:rPr>
+                <w:b/>
+                <w:bCs/>
+              </w:rPr>
+              <w:t xml:space="preserve">results list, each row with a per-place nugget</w:t>
+            </w:r>
+            <w:r>
+              <w:t xml:space="preserve"> </w:t>
+            </w:r>
+            <w:r>
+              <w:t xml:space="preserve">(curated for the well-known cities · a graceful</w:t>
+            </w:r>
+            <w:r>
+              <w:t xml:space="preserve"> </w:t>
+            </w:r>
+            <w:r>
+              <w:rPr>
+                <w:i/>
+                <w:iCs/>
+              </w:rPr>
               <w:t xml:space="preserve">“venues &amp; vendors who serve {place}”</w:t>
             </w:r>
             <w:r>
               <w:t xml:space="preserve"> </w:t>
             </w:r>
             <w:r>
-              <w:t xml:space="preserve">fallback otherwise). The 10 curated carousel cities keep precise coords + nuggets; the long-tail PSGC places carry a region-centroid coord for the Near-me sort and resolve to the same anchor model on pick.</w:t>
+              <w:t xml:space="preserve">fallback otherwise). The 30 curated carousel cities keep precise coords + nuggets + real photos; the long-tail PSGC places carry a region-centroid coord for the Near-me sort and resolve to the same anchor model on pick.</w:t>
+            </w:r>
+            <w:r>
+              <w:t xml:space="preserve"> </w:t>
+            </w:r>
+            <w:r>
+              <w:rPr>
+                <w:b/>
+                <w:bCs/>
+              </w:rPr>
+              <w:t xml:space="preserve">Photo scope (owner 2026-06-04</w:t>
+            </w:r>
+            <w:r>
+              <w:rPr>
+                <w:b/>
+                <w:bCs/>
+              </w:rPr>
+              <w:t xml:space="preserve"> </w:t>
+            </w:r>
+            <w:r>
+              <w:rPr>
+                <w:b/>
+                <w:bCs/>
+              </w:rPr>
+              <w:t xml:space="preserve">“do top 30”</w:t>
+            </w:r>
+            <w:r>
+              <w:rPr>
+                <w:b/>
+                <w:bCs/>
+              </w:rPr>
+              <w:t xml:space="preserve">):</w:t>
+            </w:r>
+            <w:r>
+              <w:t xml:space="preserve"> </w:t>
+            </w:r>
+            <w:r>
+              <w:t xml:space="preserve">real photos are the</w:t>
+            </w:r>
+            <w:r>
+              <w:t xml:space="preserve"> </w:t>
+            </w:r>
+            <w:r>
+              <w:rPr>
+                <w:b/>
+                <w:bCs/>
+              </w:rPr>
+              <w:t xml:space="preserve">Top-30 carousel’s</w:t>
+            </w:r>
+            <w:r>
+              <w:t xml:space="preserve"> </w:t>
+            </w:r>
+            <w:r>
+              <w:t xml:space="preserve">treatment only — the search-results long tail (all 1,665 PSGC localities) stays</w:t>
+            </w:r>
+            <w:r>
+              <w:t xml:space="preserve"> </w:t>
+            </w:r>
+            <w:r>
+              <w:rPr>
+                <w:b/>
+                <w:bCs/>
+              </w:rPr>
+              <w:t xml:space="preserve">nuggets/text</w:t>
+            </w:r>
+            <w:r>
+              <w:t xml:space="preserve"> </w:t>
+            </w:r>
+            <w:r>
+              <w:t xml:space="preserve">(no per-municipality photo banks · doesn’t scale · nuggets are ₱0 + infinite); a</w:t>
+            </w:r>
+            <w:r>
+              <w:t xml:space="preserve"> </w:t>
+            </w:r>
+            <w:r>
+              <w:rPr>
+                <w:b/>
+                <w:bCs/>
+              </w:rPr>
+              <w:t xml:space="preserve">17-image region-level fallback</w:t>
+            </w:r>
+            <w:r>
+              <w:t xml:space="preserve"> </w:t>
+            </w:r>
+            <w:r>
+              <w:t xml:space="preserve">is the path</w:t>
+            </w:r>
+            <w:r>
+              <w:t xml:space="preserve"> </w:t>
+            </w:r>
+            <w:r>
+              <w:rPr>
+                <w:i/>
+                <w:iCs/>
+              </w:rPr>
+              <w:t xml:space="preserve">if/when</w:t>
+            </w:r>
+            <w:r>
+              <w:t xml:space="preserve"> </w:t>
+            </w:r>
+            <w:r>
+              <w:t xml:space="preserve">a downstream</w:t>
+            </w:r>
+            <w:r>
+              <w:t xml:space="preserve"> </w:t>
+            </w:r>
+            <w:r>
+              <w:t xml:space="preserve">“your place”</w:t>
+            </w:r>
+            <w:r>
+              <w:t xml:space="preserve"> </w:t>
+            </w:r>
+            <w:r>
+              <w:t xml:space="preserve">hero is added, never per-municipality.</w:t>
             </w:r>
             <w:r>
               <w:t xml:space="preserve"> </w:t>

</xml_diff>